<commit_message>
Add minimal offline lab update with preserved legacy environment and recordings
</commit_message>
<xml_diff>
--- a/docs/视频EEG_详细操作说明.docx
+++ b/docs/视频EEG_详细操作说明.docx
@@ -32,6 +32,22 @@
       </w:pPr>
       <w:r>
         <w:t xml:space="preserve">当前默认正式题库：complete_questions_20260908/question_bank.json。</w:t>
+      </w:r>
+    </w:p>
+    <w:p>
+      <w:pPr>
+        <w:pStyle w:val="Normal"/>
+      </w:pPr>
+      <w:r>
+        <w:t xml:space="preserve"/>
+      </w:r>
+    </w:p>
+    <w:p>
+      <w:pPr>
+        <w:pStyle w:val="Normal"/>
+      </w:pPr>
+      <w:r>
+        <w:t xml:space="preserve">已在离线实验室电脑采集数据，需要用移动硬盘更新时，请使用离线最小更新说明 (OFFLINE_LAB_UPDATE.zh-CN.md)：只新增更新文件夹，保留原环境、配置、数据和旧实验入口，无需联网安装。</w:t>
       </w:r>
     </w:p>
     <w:p>

</xml_diff>

<commit_message>
Record verified complete video corpus release and enable download instructions
</commit_message>
<xml_diff>
--- a/docs/视频EEG_详细操作说明.docx
+++ b/docs/视频EEG_详细操作说明.docx
@@ -191,15 +191,7 @@
         <w:pStyle w:val="Normal"/>
       </w:pPr>
       <w:r>
-        <w:t xml:space="preserve">当前远端视频包尚在上传，完整下载状态见 材料发布状态 (MATERIALS_UPLOAD_STATUS.md)。</w:t>
-      </w:r>
-    </w:p>
-    <w:p>
-      <w:pPr>
-        <w:pStyle w:val="Normal"/>
-      </w:pPr>
-      <w:r>
-        <w:t xml:space="preserve">已有实验室母库可直接使用；新电脑可先安装并运行合成 Demo，等待材料公开后再完整下载。</w:t>
+        <w:t xml:space="preserve">完整视频附件已公开，见 材料发布状态 (MATERIALS_UPLOAD_STATUS.md)。</w:t>
       </w:r>
     </w:p>
     <w:p>

</xml_diff>